<commit_message>
Add 'The Deeds Book' (TDB) to global IP protection - fourth protected name
</commit_message>
<xml_diff>
--- a/IP_PROTECTION_SUMMARY.docx
+++ b/IP_PROTECTION_SUMMARY.docx
@@ -11,13 +11,13 @@
         <w:t xml:space="preserve">Global Intellectual Property Protection Summary</w:t>
       </w:r>
     </w:p>
-    <w:bookmarkStart w:id="20" w:name="tsm-usm-osm-complete-protection-overview"/>
+    <w:bookmarkStart w:id="20" w:name="Xbb056594a1be97aadf66e1e358ca80aa9affbbc"/>
     <w:p>
       <w:pPr>
         <w:pStyle w:val="Heading2"/>
       </w:pPr>
       <w:r>
-        <w:t xml:space="preserve">TSM • USM • OSM — Complete Protection Overview</w:t>
+        <w:t xml:space="preserve">TSM • USM • OSM • TDB — Complete Protection Overview</w:t>
       </w:r>
     </w:p>
     <w:p>
@@ -233,6 +233,40 @@
       </w:r>
       <w:r>
         <w:t xml:space="preserve">One Social Media</w:t>
+      </w:r>
+      <w:r>
+        <w:t xml:space="preserve">”</w:t>
+      </w:r>
+    </w:p>
+    <w:p>
+      <w:pPr>
+        <w:numPr>
+          <w:ilvl w:val="0"/>
+          <w:numId w:val="1001"/>
+        </w:numPr>
+        <w:pStyle w:val="Compact"/>
+      </w:pPr>
+      <w:r>
+        <w:rPr>
+          <w:bCs/>
+          <w:b/>
+        </w:rPr>
+        <w:t xml:space="preserve">TDB</w:t>
+      </w:r>
+      <w:r>
+        <w:t xml:space="preserve"> </w:t>
+      </w:r>
+      <w:r>
+        <w:t xml:space="preserve">—</w:t>
+      </w:r>
+      <w:r>
+        <w:t xml:space="preserve"> </w:t>
+      </w:r>
+      <w:r>
+        <w:t xml:space="preserve">“</w:t>
+      </w:r>
+      <w:r>
+        <w:t xml:space="preserve">The Deeds Book</w:t>
       </w:r>
       <w:r>
         <w:t xml:space="preserve">”</w:t>

</xml_diff>